<commit_message>
Word : codes QR vers les vidéos en cache
Co-Authored-By: Claude Opus 5.5 <noreply@anthropic.com>
Claude-Session: https://claude.ai/code/session_015h2h75HhBHkgwL79mLYYv1
</commit_message>
<xml_diff>
--- a/La-chute-libre.docx
+++ b/La-chute-libre.docx
@@ -301,7 +301,7 @@
                     <a:graphicData uri="http://schemas.openxmlformats.org/drawingml/2006/picture">
                       <pic:pic>
                         <pic:nvPicPr>
-                          <pic:cNvPr descr="/tmp/tmpy95k6fzb/qr-1.png" id="22" name="Picture"/>
+                          <pic:cNvPr descr="/tmp/tmpmnrr8tc8/qr-1.png" id="22" name="Picture"/>
                           <pic:cNvPicPr>
                             <a:picLocks noChangeArrowheads="1" noChangeAspect="1"/>
                           </pic:cNvPicPr>
@@ -369,7 +369,7 @@
                 <w:rPr>
                   <w:rStyle w:val="Hyperlink"/>
                 </w:rPr>
-                <w:t xml:space="preserve">https://cdn.jsdelivr.net/gh/sckurosaki/lachutelibre@main/video/video-1.mp4</w:t>
+                <w:t xml:space="preserve">https://cdn.jsdelivr.net/gh/sckurosaki/lachutelibre@84c00b00a24145c2db7a5895d5a7e1d18726b8d2/video/video-1.mp4</w:t>
               </w:r>
             </w:hyperlink>
           </w:p>
@@ -831,7 +831,7 @@
                     <a:graphicData uri="http://schemas.openxmlformats.org/drawingml/2006/picture">
                       <pic:pic>
                         <pic:nvPicPr>
-                          <pic:cNvPr descr="/tmp/tmpy95k6fzb/qr-2.png" id="29" name="Picture"/>
+                          <pic:cNvPr descr="/tmp/tmpmnrr8tc8/qr-2.png" id="29" name="Picture"/>
                           <pic:cNvPicPr>
                             <a:picLocks noChangeArrowheads="1" noChangeAspect="1"/>
                           </pic:cNvPicPr>
@@ -899,7 +899,7 @@
                 <w:rPr>
                   <w:rStyle w:val="Hyperlink"/>
                 </w:rPr>
-                <w:t xml:space="preserve">https://cdn.jsdelivr.net/gh/sckurosaki/lachutelibre@main/video/video-2.mp4</w:t>
+                <w:t xml:space="preserve">https://cdn.jsdelivr.net/gh/sckurosaki/lachutelibre@84c00b00a24145c2db7a5895d5a7e1d18726b8d2/video/video-2.mp4</w:t>
               </w:r>
             </w:hyperlink>
           </w:p>
@@ -1196,7 +1196,7 @@
                     <a:graphicData uri="http://schemas.openxmlformats.org/drawingml/2006/picture">
                       <pic:pic>
                         <pic:nvPicPr>
-                          <pic:cNvPr descr="/tmp/tmpy95k6fzb/qr-3.png" id="37" name="Picture"/>
+                          <pic:cNvPr descr="/tmp/tmpmnrr8tc8/qr-3.png" id="37" name="Picture"/>
                           <pic:cNvPicPr>
                             <a:picLocks noChangeArrowheads="1" noChangeAspect="1"/>
                           </pic:cNvPicPr>
@@ -1264,7 +1264,7 @@
                 <w:rPr>
                   <w:rStyle w:val="Hyperlink"/>
                 </w:rPr>
-                <w:t xml:space="preserve">https://cdn.jsdelivr.net/gh/sckurosaki/lachutelibre@main/video/video-3.mp4</w:t>
+                <w:t xml:space="preserve">https://cdn.jsdelivr.net/gh/sckurosaki/lachutelibre@84c00b00a24145c2db7a5895d5a7e1d18726b8d2/video/video-3.mp4</w:t>
               </w:r>
             </w:hyperlink>
           </w:p>
@@ -1376,7 +1376,7 @@
                     <a:graphicData uri="http://schemas.openxmlformats.org/drawingml/2006/picture">
                       <pic:pic>
                         <pic:nvPicPr>
-                          <pic:cNvPr descr="/tmp/tmpy95k6fzb/qr-4.png" id="42" name="Picture"/>
+                          <pic:cNvPr descr="/tmp/tmpmnrr8tc8/qr-4.png" id="42" name="Picture"/>
                           <pic:cNvPicPr>
                             <a:picLocks noChangeArrowheads="1" noChangeAspect="1"/>
                           </pic:cNvPicPr>
@@ -1501,7 +1501,7 @@
               <a:graphicData uri="http://schemas.openxmlformats.org/drawingml/2006/picture">
                 <pic:pic>
                   <pic:nvPicPr>
-                    <pic:cNvPr descr="/tmp/tmpy95k6fzb/fig-5.png" id="48" name="Picture"/>
+                    <pic:cNvPr descr="/tmp/tmpmnrr8tc8/fig-5.png" id="48" name="Picture"/>
                     <pic:cNvPicPr>
                       <a:picLocks noChangeArrowheads="1" noChangeAspect="1"/>
                     </pic:cNvPicPr>
@@ -3389,7 +3389,7 @@
               <a:graphicData uri="http://schemas.openxmlformats.org/drawingml/2006/picture">
                 <pic:pic>
                   <pic:nvPicPr>
-                    <pic:cNvPr descr="/tmp/tmpy95k6fzb/fig-6.png" id="52" name="Picture"/>
+                    <pic:cNvPr descr="/tmp/tmpmnrr8tc8/fig-6.png" id="52" name="Picture"/>
                     <pic:cNvPicPr>
                       <a:picLocks noChangeArrowheads="1" noChangeAspect="1"/>
                     </pic:cNvPicPr>
@@ -3506,7 +3506,7 @@
                     <a:graphicData uri="http://schemas.openxmlformats.org/drawingml/2006/picture">
                       <pic:pic>
                         <pic:nvPicPr>
-                          <pic:cNvPr descr="/tmp/tmpy95k6fzb/qr-7.png" id="56" name="Picture"/>
+                          <pic:cNvPr descr="/tmp/tmpmnrr8tc8/qr-7.png" id="56" name="Picture"/>
                           <pic:cNvPicPr>
                             <a:picLocks noChangeArrowheads="1" noChangeAspect="1"/>
                           </pic:cNvPicPr>
@@ -3574,7 +3574,7 @@
                 <w:rPr>
                   <w:rStyle w:val="Hyperlink"/>
                 </w:rPr>
-                <w:t xml:space="preserve">https://cdn.jsdelivr.net/gh/sckurosaki/lachutelibre@main/video/video-4.mp4</w:t>
+                <w:t xml:space="preserve">https://cdn.jsdelivr.net/gh/sckurosaki/lachutelibre@84c00b00a24145c2db7a5895d5a7e1d18726b8d2/video/video-4.mp4</w:t>
               </w:r>
             </w:hyperlink>
           </w:p>
@@ -6213,7 +6213,7 @@
                                 <a:graphicData uri="http://schemas.openxmlformats.org/drawingml/2006/picture">
                                   <pic:pic>
                                     <pic:nvPicPr>
-                                      <pic:cNvPr descr="/tmp/tmpy95k6fzb/qr-8.png" id="78" name="Picture"/>
+                                      <pic:cNvPr descr="/tmp/tmpmnrr8tc8/qr-8.png" id="78" name="Picture"/>
                                       <pic:cNvPicPr>
                                         <a:picLocks noChangeArrowheads="1" noChangeAspect="1"/>
                                       </pic:cNvPicPr>
@@ -6286,7 +6286,7 @@
                               <w:rStyle w:val="Hyperlink"/>
                               <w:color w:val="1E6B2E"/>
                             </w:rPr>
-                            <w:t xml:space="preserve">https://cdn.jsdelivr.net/gh/sckurosaki/lachutelibre@main/video/video-5.mp4</w:t>
+                            <w:t xml:space="preserve">https://cdn.jsdelivr.net/gh/sckurosaki/lachutelibre@84c00b00a24145c2db7a5895d5a7e1d18726b8d2/video/video-5.mp4</w:t>
                           </w:r>
                         </w:hyperlink>
                       </w:p>
@@ -7173,7 +7173,7 @@
                                 <a:graphicData uri="http://schemas.openxmlformats.org/drawingml/2006/picture">
                                   <pic:pic>
                                     <pic:nvPicPr>
-                                      <pic:cNvPr descr="/tmp/tmpy95k6fzb/qr-9.png" id="86" name="Picture"/>
+                                      <pic:cNvPr descr="/tmp/tmpmnrr8tc8/qr-9.png" id="86" name="Picture"/>
                                       <pic:cNvPicPr>
                                         <a:picLocks noChangeArrowheads="1" noChangeAspect="1"/>
                                       </pic:cNvPicPr>
@@ -7246,7 +7246,7 @@
                               <w:rStyle w:val="Hyperlink"/>
                               <w:color w:val="1E6B2E"/>
                             </w:rPr>
-                            <w:t xml:space="preserve">https://cdn.jsdelivr.net/gh/sckurosaki/lachutelibre@main/video/video-6.mp4</w:t>
+                            <w:t xml:space="preserve">https://cdn.jsdelivr.net/gh/sckurosaki/lachutelibre@84c00b00a24145c2db7a5895d5a7e1d18726b8d2/video/video-6.mp4</w:t>
                           </w:r>
                         </w:hyperlink>
                       </w:p>
@@ -7433,7 +7433,7 @@
                     <a:graphicData uri="http://schemas.openxmlformats.org/drawingml/2006/picture">
                       <pic:pic>
                         <pic:nvPicPr>
-                          <pic:cNvPr descr="/tmp/tmpy95k6fzb/svg-10.png" id="92" name="Picture"/>
+                          <pic:cNvPr descr="/tmp/tmpmnrr8tc8/svg-10.png" id="92" name="Picture"/>
                           <pic:cNvPicPr>
                             <a:picLocks noChangeArrowheads="1" noChangeAspect="1"/>
                           </pic:cNvPicPr>
@@ -7493,7 +7493,7 @@
                     <a:graphicData uri="http://schemas.openxmlformats.org/drawingml/2006/picture">
                       <pic:pic>
                         <pic:nvPicPr>
-                          <pic:cNvPr descr="/tmp/tmpy95k6fzb/svg-11.png" id="95" name="Picture"/>
+                          <pic:cNvPr descr="/tmp/tmpmnrr8tc8/svg-11.png" id="95" name="Picture"/>
                           <pic:cNvPicPr>
                             <a:picLocks noChangeArrowheads="1" noChangeAspect="1"/>
                           </pic:cNvPicPr>
@@ -7553,7 +7553,7 @@
                     <a:graphicData uri="http://schemas.openxmlformats.org/drawingml/2006/picture">
                       <pic:pic>
                         <pic:nvPicPr>
-                          <pic:cNvPr descr="/tmp/tmpy95k6fzb/svg-12.png" id="98" name="Picture"/>
+                          <pic:cNvPr descr="/tmp/tmpmnrr8tc8/svg-12.png" id="98" name="Picture"/>
                           <pic:cNvPicPr>
                             <a:picLocks noChangeArrowheads="1" noChangeAspect="1"/>
                           </pic:cNvPicPr>
@@ -7613,7 +7613,7 @@
                     <a:graphicData uri="http://schemas.openxmlformats.org/drawingml/2006/picture">
                       <pic:pic>
                         <pic:nvPicPr>
-                          <pic:cNvPr descr="/tmp/tmpy95k6fzb/svg-13.png" id="101" name="Picture"/>
+                          <pic:cNvPr descr="/tmp/tmpmnrr8tc8/svg-13.png" id="101" name="Picture"/>
                           <pic:cNvPicPr>
                             <a:picLocks noChangeArrowheads="1" noChangeAspect="1"/>
                           </pic:cNvPicPr>
@@ -7672,7 +7672,7 @@
               <a:graphicData uri="http://schemas.openxmlformats.org/drawingml/2006/picture">
                 <pic:pic>
                   <pic:nvPicPr>
-                    <pic:cNvPr descr="/tmp/tmpy95k6fzb/svg-14.png" id="104" name="Picture"/>
+                    <pic:cNvPr descr="/tmp/tmpmnrr8tc8/svg-14.png" id="104" name="Picture"/>
                     <pic:cNvPicPr>
                       <a:picLocks noChangeArrowheads="1" noChangeAspect="1"/>
                     </pic:cNvPicPr>
@@ -7865,7 +7865,7 @@
                     <a:graphicData uri="http://schemas.openxmlformats.org/drawingml/2006/picture">
                       <pic:pic>
                         <pic:nvPicPr>
-                          <pic:cNvPr descr="/tmp/tmpy95k6fzb/qr-15.png" id="108" name="Picture"/>
+                          <pic:cNvPr descr="/tmp/tmpmnrr8tc8/qr-15.png" id="108" name="Picture"/>
                           <pic:cNvPicPr>
                             <a:picLocks noChangeArrowheads="1" noChangeAspect="1"/>
                           </pic:cNvPicPr>
@@ -7933,7 +7933,7 @@
                 <w:rPr>
                   <w:rStyle w:val="Hyperlink"/>
                 </w:rPr>
-                <w:t xml:space="preserve">https://cdn.jsdelivr.net/gh/sckurosaki/lachutelibre@main/video/video-7.mp4</w:t>
+                <w:t xml:space="preserve">https://cdn.jsdelivr.net/gh/sckurosaki/lachutelibre@84c00b00a24145c2db7a5895d5a7e1d18726b8d2/video/video-7.mp4</w:t>
               </w:r>
             </w:hyperlink>
           </w:p>

</xml_diff>